<commit_message>
Update report for final game version
</commit_message>
<xml_diff>
--- a/红色基因接力营网页小游戏项目报告.docx
+++ b/红色基因接力营网页小游戏项目报告.docx
@@ -2617,7 +2617,7 @@
           <w:rFonts w:ascii="宋体" w:hAnsi="宋体" w:eastAsia="宋体"/>
           <w:sz w:val="22"/>
         </w:rPr>
-        <w:t>项目采用原生 HTML、CSS 和 JavaScript 实现，所有代码集中在 index.html 中，当前文件约 1206 行。CSS 使用变量定义红色、金色、纸张色等主题色，并通过响应式布局适配桌面端和移动端。JavaScript 中包含约 17 个主要函数，负责关卡渲染、答题判断、精神火种统计、路线解锁、卡片收集、图片加载和最终总结。</w:t>
+        <w:t>项目采用原生 HTML、CSS 和 JavaScript 实现，所有代码集中在 index.html 中，当前文件约 1212 行。CSS 使用变量定义红色、金色、纸张色等主题色，并通过响应式布局适配桌面端和移动端。JavaScript 中包含约 17 个主要函数，负责关卡渲染、答题判断、精神火种统计、路线解锁、卡片收集、图片加载和最终总结。</w:t>
       </w:r>
     </w:p>
     <w:p>
@@ -2781,7 +2781,7 @@
           <w:rFonts w:ascii="宋体" w:hAnsi="宋体" w:eastAsia="宋体"/>
           <w:sz w:val="22"/>
         </w:rPr>
-        <w:t>项目当前记录的在线访问链接为：https://pagedrop.dev/s/2UwwMmp2/</w:t>
+        <w:t>项目当前记录的在线访问链接为：https://lydiabeckerwg8.github.io/red-gene-jieliying-game/</w:t>
       </w:r>
     </w:p>
     <w:p>

</xml_diff>